<commit_message>
adicionando documentação e alterações do README
</commit_message>
<xml_diff>
--- a/documentos/Projeto de Extensão - Maya Yamamoto.docx
+++ b/documentos/Projeto de Extensão - Maya Yamamoto.docx
@@ -258,13 +258,15 @@
         <w:tblLook w:val="0000" w:firstRow="0" w:lastRow="0" w:firstColumn="0" w:lastColumn="0" w:noHBand="0" w:noVBand="0"/>
       </w:tblPr>
       <w:tblGrid>
-        <w:gridCol w:w="6675"/>
+        <w:gridCol w:w="15"/>
+        <w:gridCol w:w="6660"/>
         <w:gridCol w:w="2700"/>
       </w:tblGrid>
       <w:tr>
         <w:tc>
           <w:tcPr>
             <w:tcW w:w="6675" w:type="dxa"/>
+            <w:gridSpan w:val="2"/>
           </w:tcPr>
           <w:p>
             <w:pPr>
@@ -326,13 +328,14 @@
         <w:tc>
           <w:tcPr>
             <w:tcW w:w="6675" w:type="dxa"/>
+            <w:gridSpan w:val="2"/>
           </w:tcPr>
           <w:p>
             <w:pPr>
               <w:spacing w:after="0" w:line="240" w:lineRule="auto"/>
               <w:rPr>
                 <w:rFonts w:ascii="Arial" w:eastAsia="Arial" w:hAnsi="Arial" w:cs="Arial"/>
-                <w:color w:val="000000" w:themeColor="text1"/>
+                <w:bCs/>
                 <w:sz w:val="20"/>
                 <w:szCs w:val="20"/>
               </w:rPr>
@@ -340,11 +343,31 @@
             <w:r>
               <w:rPr>
                 <w:rFonts w:ascii="Arial" w:eastAsia="Arial" w:hAnsi="Arial" w:cs="Arial"/>
-                <w:color w:val="000000" w:themeColor="text1"/>
-                <w:sz w:val="20"/>
-                <w:szCs w:val="20"/>
-              </w:rPr>
-              <w:t>Said Sales de Sousa</w:t>
+                <w:bCs/>
+                <w:sz w:val="20"/>
+                <w:szCs w:val="20"/>
+              </w:rPr>
+              <w:t xml:space="preserve">Gabriel </w:t>
+            </w:r>
+            <w:proofErr w:type="spellStart"/>
+            <w:r>
+              <w:rPr>
+                <w:rFonts w:ascii="Arial" w:eastAsia="Arial" w:hAnsi="Arial" w:cs="Arial"/>
+                <w:bCs/>
+                <w:sz w:val="20"/>
+                <w:szCs w:val="20"/>
+              </w:rPr>
+              <w:t>Vazquez</w:t>
+            </w:r>
+            <w:proofErr w:type="spellEnd"/>
+            <w:r>
+              <w:rPr>
+                <w:rFonts w:ascii="Arial" w:eastAsia="Arial" w:hAnsi="Arial" w:cs="Arial"/>
+                <w:bCs/>
+                <w:sz w:val="20"/>
+                <w:szCs w:val="20"/>
+              </w:rPr>
+              <w:t xml:space="preserve"> Mamede Diniz</w:t>
             </w:r>
           </w:p>
           <w:p>
@@ -381,7 +404,7 @@
                 <w:sz w:val="20"/>
                 <w:szCs w:val="20"/>
               </w:rPr>
-              <w:t>25027606</w:t>
+              <w:t>25027858</w:t>
             </w:r>
           </w:p>
         </w:tc>
@@ -390,6 +413,7 @@
         <w:tc>
           <w:tcPr>
             <w:tcW w:w="6675" w:type="dxa"/>
+            <w:gridSpan w:val="2"/>
           </w:tcPr>
           <w:p>
             <w:pPr>
@@ -450,9 +474,13 @@
         </w:tc>
       </w:tr>
       <w:tr>
+        <w:trPr>
+          <w:gridBefore w:val="1"/>
+          <w:wBefore w:w="15" w:type="dxa"/>
+        </w:trPr>
         <w:tc>
           <w:tcPr>
-            <w:tcW w:w="6675" w:type="dxa"/>
+            <w:tcW w:w="6660" w:type="dxa"/>
           </w:tcPr>
           <w:p>
             <w:pPr>
@@ -471,27 +499,7 @@
                 <w:sz w:val="20"/>
                 <w:szCs w:val="20"/>
               </w:rPr>
-              <w:t xml:space="preserve">Gabriel </w:t>
-            </w:r>
-            <w:proofErr w:type="spellStart"/>
-            <w:r>
-              <w:rPr>
-                <w:rFonts w:ascii="Arial" w:eastAsia="Arial" w:hAnsi="Arial" w:cs="Arial"/>
-                <w:bCs/>
-                <w:sz w:val="20"/>
-                <w:szCs w:val="20"/>
-              </w:rPr>
-              <w:t>Vazquez</w:t>
-            </w:r>
-            <w:proofErr w:type="spellEnd"/>
-            <w:r>
-              <w:rPr>
-                <w:rFonts w:ascii="Arial" w:eastAsia="Arial" w:hAnsi="Arial" w:cs="Arial"/>
-                <w:bCs/>
-                <w:sz w:val="20"/>
-                <w:szCs w:val="20"/>
-              </w:rPr>
-              <w:t xml:space="preserve"> Mamede Diniz</w:t>
+              <w:t>Leticia Rodrigues da Silva</w:t>
             </w:r>
           </w:p>
           <w:p>
@@ -527,7 +535,7 @@
                 <w:sz w:val="20"/>
                 <w:szCs w:val="20"/>
               </w:rPr>
-              <w:t>25027858</w:t>
+              <w:t>25027748</w:t>
             </w:r>
           </w:p>
         </w:tc>
@@ -536,13 +544,14 @@
         <w:tc>
           <w:tcPr>
             <w:tcW w:w="6675" w:type="dxa"/>
+            <w:gridSpan w:val="2"/>
           </w:tcPr>
           <w:p>
             <w:pPr>
               <w:spacing w:after="0" w:line="240" w:lineRule="auto"/>
               <w:rPr>
                 <w:rFonts w:ascii="Arial" w:eastAsia="Arial" w:hAnsi="Arial" w:cs="Arial"/>
-                <w:bCs/>
+                <w:color w:val="000000" w:themeColor="text1"/>
                 <w:sz w:val="20"/>
                 <w:szCs w:val="20"/>
               </w:rPr>
@@ -550,11 +559,11 @@
             <w:r>
               <w:rPr>
                 <w:rFonts w:ascii="Arial" w:eastAsia="Arial" w:hAnsi="Arial" w:cs="Arial"/>
-                <w:bCs/>
-                <w:sz w:val="20"/>
-                <w:szCs w:val="20"/>
-              </w:rPr>
-              <w:t>Leticia Rodrigues da Silva</w:t>
+                <w:color w:val="000000" w:themeColor="text1"/>
+                <w:sz w:val="20"/>
+                <w:szCs w:val="20"/>
+              </w:rPr>
+              <w:t>Said Sales de Sousa</w:t>
             </w:r>
           </w:p>
           <w:p>
@@ -590,7 +599,7 @@
                 <w:sz w:val="20"/>
                 <w:szCs w:val="20"/>
               </w:rPr>
-              <w:t>25027748</w:t>
+              <w:t>25027606</w:t>
             </w:r>
           </w:p>
         </w:tc>
@@ -1128,18 +1137,6 @@
               </w:rPr>
               <w:t xml:space="preserve"> ✓</w:t>
             </w:r>
-          </w:p>
-          <w:p>
-            <w:pPr>
-              <w:shd w:val="clear" w:color="auto" w:fill="FFFFFF"/>
-              <w:spacing w:after="0" w:line="240" w:lineRule="auto"/>
-              <w:ind w:left="720"/>
-              <w:rPr>
-                <w:rFonts w:ascii="Arial" w:eastAsia="Arial" w:hAnsi="Arial" w:cs="Arial"/>
-                <w:sz w:val="20"/>
-                <w:szCs w:val="20"/>
-              </w:rPr>
-            </w:pPr>
           </w:p>
         </w:tc>
       </w:tr>
@@ -1218,7 +1215,7 @@
                 <w:sz w:val="20"/>
                 <w:szCs w:val="20"/>
               </w:rPr>
-              <w:t xml:space="preserve"> Criar um</w:t>
+              <w:t>Criar um</w:t>
             </w:r>
             <w:r>
               <w:rPr>
@@ -1510,6 +1507,7 @@
           <w:sz w:val="20"/>
           <w:szCs w:val="20"/>
         </w:rPr>
+        <w:lastRenderedPageBreak/>
         <w:t>2. IDENTIFICAÇÃO DO CENÁRIO DE INTERVENÇÃO E HIPÓTESES DE SOLUÇÃO</w:t>
       </w:r>
     </w:p>
@@ -3091,7 +3089,7 @@
                 <w:sz w:val="20"/>
                 <w:szCs w:val="20"/>
               </w:rPr>
-              <w:t>o b</w:t>
+              <w:t xml:space="preserve">o </w:t>
             </w:r>
             <w:proofErr w:type="spellStart"/>
             <w:r>
@@ -3101,7 +3099,7 @@
                 <w:sz w:val="20"/>
                 <w:szCs w:val="20"/>
               </w:rPr>
-              <w:t>ackend</w:t>
+              <w:t>backend</w:t>
             </w:r>
             <w:proofErr w:type="spellEnd"/>
             <w:r>
@@ -3508,18 +3506,6 @@
               </w:rPr>
               <w:t xml:space="preserve"> devidamente definida.</w:t>
             </w:r>
-          </w:p>
-          <w:p>
-            <w:pPr>
-              <w:spacing w:after="0" w:line="240" w:lineRule="auto"/>
-              <w:jc w:val="both"/>
-              <w:rPr>
-                <w:rFonts w:ascii="Arial" w:eastAsia="Arial" w:hAnsi="Arial" w:cs="Arial"/>
-                <w:color w:val="000000" w:themeColor="text1"/>
-                <w:sz w:val="20"/>
-                <w:szCs w:val="20"/>
-              </w:rPr>
-            </w:pPr>
           </w:p>
         </w:tc>
       </w:tr>
@@ -3580,6 +3566,7 @@
               <w:jc w:val="both"/>
               <w:rPr>
                 <w:rFonts w:ascii="Arial" w:eastAsia="Arial" w:hAnsi="Arial" w:cs="Arial"/>
+                <w:color w:val="000000" w:themeColor="text1"/>
                 <w:sz w:val="20"/>
                 <w:szCs w:val="20"/>
               </w:rPr>
@@ -4142,6 +4129,18 @@
           <w:szCs w:val="20"/>
         </w:rPr>
       </w:pPr>
+    </w:p>
+    <w:p>
+      <w:pPr>
+        <w:spacing w:after="0" w:line="240" w:lineRule="auto"/>
+        <w:jc w:val="center"/>
+        <w:rPr>
+          <w:rFonts w:ascii="Arial" w:eastAsia="Arial" w:hAnsi="Arial" w:cs="Arial"/>
+          <w:b/>
+          <w:sz w:val="20"/>
+          <w:szCs w:val="20"/>
+        </w:rPr>
+      </w:pPr>
       <w:r>
         <w:rPr>
           <w:rFonts w:ascii="Arial" w:eastAsia="Arial" w:hAnsi="Arial" w:cs="Arial"/>
@@ -4380,6 +4379,7 @@
                 <w:sz w:val="20"/>
                 <w:szCs w:val="20"/>
               </w:rPr>
+              <w:lastRenderedPageBreak/>
               <w:t>Regulamento das Atividade de Extensão</w:t>
             </w:r>
           </w:p>
@@ -4435,7 +4435,7 @@
           <w:sz w:val="20"/>
           <w:szCs w:val="20"/>
         </w:rPr>
-        <w:t>Versão 2.0 – 10/2024</w:t>
+        <w:t>Versão 3.0 – 05/2026</w:t>
       </w:r>
     </w:p>
     <w:sectPr>
@@ -5410,6 +5410,7 @@
   <w:style w:type="character" w:default="1" w:styleId="Fontepargpadro">
     <w:name w:val="Default Paragraph Font"/>
     <w:uiPriority w:val="1"/>
+    <w:semiHidden/>
     <w:unhideWhenUsed/>
   </w:style>
   <w:style w:type="table" w:default="1" w:styleId="Tabelanormal">
@@ -5822,6 +5823,10 @@
 </file>
 
 <file path=customXml/item1.xml><?xml version="1.0" encoding="utf-8"?>
+<b:Sources xmlns:b="http://schemas.openxmlformats.org/officeDocument/2006/bibliography" xmlns="http://schemas.openxmlformats.org/officeDocument/2006/bibliography" SelectedStyle="\APASixthEditionOfficeOnline.xsl" StyleName="APA" Version="6"/>
+</file>
+
+<file path=customXml/item2.xml><?xml version="1.0" encoding="utf-8"?>
 <?mso-contentType ?>
 <FormTemplates xmlns="http://schemas.microsoft.com/sharepoint/v3/contenttype/forms">
   <Display>DocumentLibraryForm</Display>
@@ -5830,7 +5835,7 @@
 </FormTemplates>
 </file>
 
-<file path=customXml/item2.xml><?xml version="1.0" encoding="utf-8"?>
+<file path=customXml/item3.xml><?xml version="1.0" encoding="utf-8"?>
 <p:properties xmlns:p="http://schemas.microsoft.com/office/2006/metadata/properties" xmlns:xsi="http://www.w3.org/2001/XMLSchema-instance" xmlns:pc="http://schemas.microsoft.com/office/infopath/2007/PartnerControls">
   <documentManagement>
     <lcf76f155ced4ddcb4097134ff3c332f xmlns="8ca2a57e-8138-4b57-956a-eb6e2c7049cc">
@@ -5841,7 +5846,7 @@
 </p:properties>
 </file>
 
-<file path=customXml/item3.xml><?xml version="1.0" encoding="utf-8"?>
+<file path=customXml/item4.xml><?xml version="1.0" encoding="utf-8"?>
 <ct:contentTypeSchema xmlns:ct="http://schemas.microsoft.com/office/2006/metadata/contentType" xmlns:ma="http://schemas.microsoft.com/office/2006/metadata/properties/metaAttributes" ct:_="" ma:_="" ma:contentTypeName="Documento" ma:contentTypeID="0x01010045364877AF745B4281652B53F43C594A" ma:contentTypeVersion="15" ma:contentTypeDescription="Crie um novo documento." ma:contentTypeScope="" ma:versionID="440a6fbbcbce65e3f8e2bed610644788">
   <xsd:schema xmlns:xsd="http://www.w3.org/2001/XMLSchema" xmlns:xs="http://www.w3.org/2001/XMLSchema" xmlns:p="http://schemas.microsoft.com/office/2006/metadata/properties" xmlns:ns2="1d2798d9-1030-4cc5-be7b-200f9e628651" xmlns:ns3="8ca2a57e-8138-4b57-956a-eb6e2c7049cc" targetNamespace="http://schemas.microsoft.com/office/2006/metadata/properties" ma:root="true" ma:fieldsID="3ff20d9b6411658b7762fa2c08d7e1af" ns2:_="" ns3:_="">
     <xsd:import namespace="1d2798d9-1030-4cc5-be7b-200f9e628651"/>
@@ -6076,11 +6081,15 @@
 </ct:contentTypeSchema>
 </file>
 
-<file path=customXml/item4.xml><?xml version="1.0" encoding="utf-8"?>
-<b:Sources xmlns:b="http://schemas.openxmlformats.org/officeDocument/2006/bibliography" xmlns="http://schemas.openxmlformats.org/officeDocument/2006/bibliography" SelectedStyle="\APASixthEditionOfficeOnline.xsl" StyleName="APA" Version="6"/>
+<file path=customXml/itemProps1.xml><?xml version="1.0" encoding="utf-8"?>
+<ds:datastoreItem xmlns:ds="http://schemas.openxmlformats.org/officeDocument/2006/customXml" ds:itemID="{7D7EEA99-929A-4E24-AA53-FDFBA888ACC8}">
+  <ds:schemaRefs>
+    <ds:schemaRef ds:uri="http://schemas.openxmlformats.org/officeDocument/2006/bibliography"/>
+  </ds:schemaRefs>
+</ds:datastoreItem>
 </file>
 
-<file path=customXml/itemProps1.xml><?xml version="1.0" encoding="utf-8"?>
+<file path=customXml/itemProps2.xml><?xml version="1.0" encoding="utf-8"?>
 <ds:datastoreItem xmlns:ds="http://schemas.openxmlformats.org/officeDocument/2006/customXml" ds:itemID="{6C7D064E-B9B1-4DD1-96C1-B59BEDBDE508}">
   <ds:schemaRefs>
     <ds:schemaRef ds:uri="http://schemas.microsoft.com/sharepoint/v3/contenttype/forms"/>
@@ -6088,7 +6097,7 @@
 </ds:datastoreItem>
 </file>
 
-<file path=customXml/itemProps2.xml><?xml version="1.0" encoding="utf-8"?>
+<file path=customXml/itemProps3.xml><?xml version="1.0" encoding="utf-8"?>
 <ds:datastoreItem xmlns:ds="http://schemas.openxmlformats.org/officeDocument/2006/customXml" ds:itemID="{DEC3F211-A3ED-4D74-812F-955FD328EBB9}">
   <ds:schemaRefs>
     <ds:schemaRef ds:uri="http://schemas.microsoft.com/office/2006/metadata/properties"/>
@@ -6099,7 +6108,7 @@
 </ds:datastoreItem>
 </file>
 
-<file path=customXml/itemProps3.xml><?xml version="1.0" encoding="utf-8"?>
+<file path=customXml/itemProps4.xml><?xml version="1.0" encoding="utf-8"?>
 <ds:datastoreItem xmlns:ds="http://schemas.openxmlformats.org/officeDocument/2006/customXml" ds:itemID="{5C49EB71-DCC6-4AD6-B283-AD28F75E5568}">
   <ds:schemaRefs>
     <ds:schemaRef ds:uri="http://schemas.microsoft.com/office/2006/metadata/contentType"/>
@@ -6116,12 +6125,4 @@
     <ds:schemaRef ds:uri="http://schemas.microsoft.com/internal/obd"/>
   </ds:schemaRefs>
 </ds:datastoreItem>
-</file>
-
-<file path=customXml/itemProps4.xml><?xml version="1.0" encoding="utf-8"?>
-<ds:datastoreItem xmlns:ds="http://schemas.openxmlformats.org/officeDocument/2006/customXml" ds:itemID="{7D7EEA99-929A-4E24-AA53-FDFBA888ACC8}">
-  <ds:schemaRefs>
-    <ds:schemaRef ds:uri="http://schemas.openxmlformats.org/officeDocument/2006/bibliography"/>
-  </ds:schemaRefs>
-</ds:datastoreItem>
 </file>
</xml_diff>